<commit_message>
docs: Documentacao 1.1 com RF03 implementado (574e359)
</commit_message>
<xml_diff>
--- a/documentacao/Documentacao-Sentinel1.1.docx
+++ b/documentacao/Documentacao-Sentinel1.1.docx
@@ -513,7 +513,14 @@
                 <w:sz w:val="16"/>
                 <w:szCs w:val="16"/>
               </w:rPr>
-              <w:t xml:space="preserve">ae79781</w:t>
+              <w:t xml:space="preserve">574e359</w:t>
+            </w:r>
+            <w:r>
+              <w:rPr>
+                <w:sz w:val="18"/>
+                <w:szCs w:val="18"/>
+              </w:rPr>
+              <w:t xml:space="preserve"> (RF03 incluído em 28/10/2026)</w:t>
             </w:r>
           </w:p>
         </w:tc>
@@ -580,7 +587,7 @@
                 <w:sz w:val="18"/>
                 <w:szCs w:val="18"/>
               </w:rPr>
-              <w:t xml:space="preserve">Construção (Fases 0 a 5) concluída; teste manual e preparação da apresentação na Fase 6; congelamento de funcionalidades com data em aberto; entrega final em 25/11/2026</w:t>
+              <w:t xml:space="preserve">Construção (Fases 0 a 5) concluída e RF03 implementado; teste manual e preparação da apresentação na Fase 6; congelamento de funcionalidades com data em aberto; entrega final em 25/11/2026</w:t>
             </w:r>
           </w:p>
         </w:tc>
@@ -2401,7 +2408,7 @@
               <w:szCs w:val="19"/>
             </w:rPr>
             <w:tab/>
-            <w:t>44</w:t>
+            <w:t>45</w:t>
           </w:r>
         </w:p>
         <w:p>
@@ -2539,7 +2546,7 @@
               <w:szCs w:val="19"/>
             </w:rPr>
             <w:tab/>
-            <w:t>47</w:t>
+            <w:t>48</w:t>
           </w:r>
         </w:p>
         <w:p>
@@ -2703,7 +2710,7 @@
               <w:szCs w:val="20"/>
             </w:rPr>
             <w:tab/>
-            <w:t>52</w:t>
+            <w:t>53</w:t>
           </w:r>
         </w:p>
         <w:p>
@@ -2733,7 +2740,7 @@
               <w:szCs w:val="20"/>
             </w:rPr>
             <w:tab/>
-            <w:t>53</w:t>
+            <w:t>55</w:t>
           </w:r>
         </w:p>
         <w:p>
@@ -2759,7 +2766,7 @@
               <w:szCs w:val="19"/>
             </w:rPr>
             <w:tab/>
-            <w:t>53</w:t>
+            <w:t>55</w:t>
           </w:r>
         </w:p>
         <w:p>
@@ -2785,7 +2792,7 @@
               <w:szCs w:val="19"/>
             </w:rPr>
             <w:tab/>
-            <w:t>53</w:t>
+            <w:t>55</w:t>
           </w:r>
         </w:p>
         <w:p>
@@ -2815,7 +2822,7 @@
               <w:szCs w:val="20"/>
             </w:rPr>
             <w:tab/>
-            <w:t>54</w:t>
+            <w:t>56</w:t>
           </w:r>
         </w:p>
         <w:p>
@@ -2845,7 +2852,7 @@
               <w:szCs w:val="20"/>
             </w:rPr>
             <w:tab/>
-            <w:t>55</w:t>
+            <w:t>57</w:t>
           </w:r>
         </w:p>
         <w:p>
@@ -3637,7 +3644,7 @@
                 <w:sz w:val="18"/>
                 <w:szCs w:val="18"/>
               </w:rPr>
-              <w:t xml:space="preserve">Especificado (seção 13.3)</w:t>
+              <w:t xml:space="preserve">Implementado (seção 13.3)</w:t>
             </w:r>
           </w:p>
         </w:tc>
@@ -4255,7 +4262,7 @@
         <w:jc w:val="both"/>
       </w:pPr>
       <w:r>
-        <w:t xml:space="preserve">Esta seção resume o que existe no repositório ao fim da construção (Fases 0 a 5), na revisão </w:t>
+        <w:t xml:space="preserve">Esta seção resume o que existe no repositório ao fim da construção (Fases 0 a 5) e da implementação do RF03, na revisão </w:t>
       </w:r>
       <w:r>
         <w:rPr>
@@ -4264,7 +4271,7 @@
           <w:sz w:val="19"/>
           <w:szCs w:val="19"/>
         </w:rPr>
-        <w:t xml:space="preserve">ae79781</w:t>
+        <w:t xml:space="preserve">574e359</w:t>
       </w:r>
       <w:r>
         <w:t xml:space="preserve"> da branch </w:t>
@@ -4484,7 +4491,7 @@
                 <w:sz w:val="18"/>
                 <w:szCs w:val="18"/>
               </w:rPr>
-              <w:t xml:space="preserve">37</w:t>
+              <w:t xml:space="preserve">38</w:t>
             </w:r>
           </w:p>
         </w:tc>
@@ -4515,7 +4522,7 @@
                 <w:sz w:val="18"/>
                 <w:szCs w:val="18"/>
               </w:rPr>
-              <w:t xml:space="preserve">7 consultas, 6 cadastros, 6 atualizações, 6 exclusões, 6 restaurações, 6 exclusões definitivas</w:t>
+              <w:t xml:space="preserve">7 consultas, 6 cadastros, 6 atualizações, 1 conciliação em lote, 6 exclusões, 6 restaurações, 6 exclusões definitivas</w:t>
             </w:r>
           </w:p>
         </w:tc>
@@ -4778,7 +4785,7 @@
                 <w:sz w:val="18"/>
                 <w:szCs w:val="18"/>
               </w:rPr>
-              <w:t xml:space="preserve">15</w:t>
+              <w:t xml:space="preserve">16</w:t>
             </w:r>
           </w:p>
         </w:tc>
@@ -4876,7 +4883,7 @@
                 <w:sz w:val="18"/>
                 <w:szCs w:val="18"/>
               </w:rPr>
-              <w:t xml:space="preserve">398 casos</w:t>
+              <w:t xml:space="preserve">414 casos</w:t>
             </w:r>
           </w:p>
         </w:tc>
@@ -4907,7 +4914,7 @@
                 <w:sz w:val="18"/>
                 <w:szCs w:val="18"/>
               </w:rPr>
-              <w:t xml:space="preserve">29 arquivos, 3.882 asserções, todos verdes</w:t>
+              <w:t xml:space="preserve">30 arquivos, todos verdes</w:t>
             </w:r>
           </w:p>
         </w:tc>
@@ -5088,7 +5095,7 @@
                 <w:sz w:val="18"/>
                 <w:szCs w:val="18"/>
               </w:rPr>
-              <w:t xml:space="preserve">≈ 6.500 linhas</w:t>
+              <w:t xml:space="preserve">≈ 6.900 linhas</w:t>
             </w:r>
           </w:p>
         </w:tc>
@@ -5135,7 +5142,7 @@
                 <w:sz w:val="18"/>
                 <w:szCs w:val="18"/>
               </w:rPr>
-              <w:t xml:space="preserve"> sozinho tem ≈ 1.950 linhas</w:t>
+              <w:t xml:space="preserve"> sozinho tem ≈ 2.200 linhas</w:t>
             </w:r>
           </w:p>
         </w:tc>
@@ -8363,7 +8370,7 @@
       <w:r>
         <w:drawing>
           <wp:inline distT="0" distB="0" distL="0" distR="0">
-            <wp:extent cx="5762625" cy="4210050"/>
+            <wp:extent cx="5760720" cy="4210562"/>
             <wp:effectExtent t="0" r="0" b="0" l="0"/>
             <wp:docPr id="1" name="04_arquitetura.png" descr="Arquitetura em camadas do Sentinel e os princípios que a regem." title="Figura 4"/>
             <wp:cNvGraphicFramePr>
@@ -8388,7 +8395,7 @@
                   <pic:spPr bwMode="auto">
                     <a:xfrm>
                       <a:off x="0" y="0"/>
-                      <a:ext cx="5762625" cy="4210050"/>
+                      <a:ext cx="5760720" cy="4210562"/>
                     </a:xfrm>
                     <a:prstGeom prst="rect">
                       <a:avLst/>
@@ -8808,7 +8815,7 @@
                 <w:sz w:val="18"/>
                 <w:szCs w:val="18"/>
               </w:rPr>
-              <w:t xml:space="preserve">Ferramentas (catálogo de 37 tools)</w:t>
+              <w:t xml:space="preserve">Ferramentas (catálogo de 38 tools)</w:t>
             </w:r>
           </w:p>
         </w:tc>
@@ -9426,8 +9433,8 @@
               <w:rPr>
                 <w:rFonts w:ascii="Consolas" w:cs="Consolas" w:eastAsia="Consolas" w:hAnsi="Consolas"/>
                 <w:color w:val="2E5B85"/>
-                <w:sz w:val="16"/>
-                <w:szCs w:val="16"/>
+                <w:sz w:val="14"/>
+                <w:szCs w:val="14"/>
               </w:rPr>
               <w:t xml:space="preserve">ConfirmacoesPendentes</w:t>
             </w:r>
@@ -9476,7 +9483,23 @@
                 <w:sz w:val="18"/>
                 <w:szCs w:val="18"/>
               </w:rPr>
-              <w:t xml:space="preserve">), varredura de vencidas e tempo da IA</w:t>
+              <w:t xml:space="preserve">), varredura de vencidas e tempo da IA; no lote do RF03, também a lista de ids congelada (</w:t>
+            </w:r>
+            <w:r>
+              <w:rPr>
+                <w:rFonts w:ascii="Consolas" w:cs="Consolas" w:eastAsia="Consolas" w:hAnsi="Consolas"/>
+                <w:color w:val="2E5B85"/>
+                <w:sz w:val="16"/>
+                <w:szCs w:val="16"/>
+              </w:rPr>
+              <w:t xml:space="preserve">loteIds()</w:t>
+            </w:r>
+            <w:r>
+              <w:rPr>
+                <w:sz w:val="18"/>
+                <w:szCs w:val="18"/>
+              </w:rPr>
+              <w:t xml:space="preserve">)</w:t>
             </w:r>
           </w:p>
         </w:tc>
@@ -13838,25 +13861,25 @@
               <w:bottom w:val="single" w:color="C9C2A8" w:sz="4"/>
               <w:right w:val="single" w:color="C9C2A8" w:sz="4"/>
             </w:tcBorders>
-            <w:shd w:fill="FBF9F1" w:color="auto" w:val="clear"/>
-            <w:tcMar>
-              <w:top w:type="dxa" w:w="60"/>
-              <w:left w:type="dxa" w:w="100"/>
-              <w:bottom w:type="dxa" w:w="60"/>
-              <w:right w:type="dxa" w:w="100"/>
-            </w:tcMar>
-            <w:vAlign w:val="center"/>
-          </w:tcPr>
-          <w:p>
-            <w:pPr>
-              <w:spacing w:after="20" w:line="260"/>
-            </w:pPr>
-            <w:r>
-              <w:rPr>
-                <w:sz w:val="18"/>
-                <w:szCs w:val="18"/>
-              </w:rPr>
-              <w:t xml:space="preserve">Exclusões (6)</w:t>
+            <w:shd w:fill="FFFFFF" w:color="auto" w:val="clear"/>
+            <w:tcMar>
+              <w:top w:type="dxa" w:w="60"/>
+              <w:left w:type="dxa" w:w="100"/>
+              <w:bottom w:type="dxa" w:w="60"/>
+              <w:right w:type="dxa" w:w="100"/>
+            </w:tcMar>
+            <w:vAlign w:val="center"/>
+          </w:tcPr>
+          <w:p>
+            <w:pPr>
+              <w:spacing w:after="20" w:line="260"/>
+            </w:pPr>
+            <w:r>
+              <w:rPr>
+                <w:sz w:val="18"/>
+                <w:szCs w:val="18"/>
+              </w:rPr>
+              <w:t xml:space="preserve">Lote (1)</w:t>
             </w:r>
           </w:p>
         </w:tc>
@@ -13869,7 +13892,7 @@
               <w:bottom w:val="single" w:color="C9C2A8" w:sz="4"/>
               <w:right w:val="single" w:color="C9C2A8" w:sz="4"/>
             </w:tcBorders>
-            <w:shd w:fill="FBF9F1" w:color="auto" w:val="clear"/>
+            <w:shd w:fill="FFFFFF" w:color="auto" w:val="clear"/>
             <w:tcMar>
               <w:top w:type="dxa" w:w="60"/>
               <w:left w:type="dxa" w:w="100"/>
@@ -13886,17 +13909,17 @@
               <w:rPr>
                 <w:rFonts w:ascii="Consolas" w:cs="Consolas" w:eastAsia="Consolas" w:hAnsi="Consolas"/>
                 <w:color w:val="2E5B85"/>
+                <w:sz w:val="14"/>
+                <w:szCs w:val="14"/>
+              </w:rPr>
+              <w:t xml:space="preserve">conciliar_lancamentos_em_lote</w:t>
+            </w:r>
+            <w:r>
+              <w:rPr>
                 <w:sz w:val="16"/>
                 <w:szCs w:val="16"/>
               </w:rPr>
-              <w:t xml:space="preserve">excluir_&lt;entidade&gt;</w:t>
-            </w:r>
-            <w:r>
-              <w:rPr>
-                <w:sz w:val="18"/>
-                <w:szCs w:val="18"/>
-              </w:rPr>
-              <w:t xml:space="preserve">: move para a lixeira se nada depender do registro</w:t>
+              <w:t xml:space="preserve">: concilia de uma vez até 25 lançamentos pendentes de um período (RF03, seção 13.3)</w:t>
             </w:r>
           </w:p>
         </w:tc>
@@ -13909,25 +13932,25 @@
               <w:bottom w:val="single" w:color="C9C2A8" w:sz="4"/>
               <w:right w:val="single" w:color="C9C2A8" w:sz="4"/>
             </w:tcBorders>
-            <w:shd w:fill="FBF9F1" w:color="auto" w:val="clear"/>
-            <w:tcMar>
-              <w:top w:type="dxa" w:w="60"/>
-              <w:left w:type="dxa" w:w="100"/>
-              <w:bottom w:type="dxa" w:w="60"/>
-              <w:right w:type="dxa" w:w="100"/>
-            </w:tcMar>
-            <w:vAlign w:val="center"/>
-          </w:tcPr>
-          <w:p>
-            <w:pPr>
-              <w:spacing w:after="20" w:line="260"/>
-            </w:pPr>
-            <w:r>
-              <w:rPr>
-                <w:sz w:val="18"/>
-                <w:szCs w:val="18"/>
-              </w:rPr>
-              <w:t xml:space="preserve">exclusão</w:t>
+            <w:shd w:fill="FFFFFF" w:color="auto" w:val="clear"/>
+            <w:tcMar>
+              <w:top w:type="dxa" w:w="60"/>
+              <w:left w:type="dxa" w:w="100"/>
+              <w:bottom w:type="dxa" w:w="60"/>
+              <w:right w:type="dxa" w:w="100"/>
+            </w:tcMar>
+            <w:vAlign w:val="center"/>
+          </w:tcPr>
+          <w:p>
+            <w:pPr>
+              <w:spacing w:after="20" w:line="260"/>
+            </w:pPr>
+            <w:r>
+              <w:rPr>
+                <w:sz w:val="18"/>
+                <w:szCs w:val="18"/>
+              </w:rPr>
+              <w:t xml:space="preserve">escrita</w:t>
             </w:r>
           </w:p>
         </w:tc>
@@ -13940,25 +13963,25 @@
               <w:bottom w:val="single" w:color="C9C2A8" w:sz="4"/>
               <w:right w:val="single" w:color="C9C2A8" w:sz="4"/>
             </w:tcBorders>
-            <w:shd w:fill="FBF9F1" w:color="auto" w:val="clear"/>
-            <w:tcMar>
-              <w:top w:type="dxa" w:w="60"/>
-              <w:left w:type="dxa" w:w="100"/>
-              <w:bottom w:type="dxa" w:w="60"/>
-              <w:right w:type="dxa" w:w="100"/>
-            </w:tcMar>
-            <w:vAlign w:val="center"/>
-          </w:tcPr>
-          <w:p>
-            <w:pPr>
-              <w:spacing w:after="20" w:line="260"/>
-            </w:pPr>
-            <w:r>
-              <w:rPr>
-                <w:sz w:val="18"/>
-                <w:szCs w:val="18"/>
-              </w:rPr>
-              <w:t xml:space="preserve">admin</w:t>
+            <w:shd w:fill="FFFFFF" w:color="auto" w:val="clear"/>
+            <w:tcMar>
+              <w:top w:type="dxa" w:w="60"/>
+              <w:left w:type="dxa" w:w="100"/>
+              <w:bottom w:type="dxa" w:w="60"/>
+              <w:right w:type="dxa" w:w="100"/>
+            </w:tcMar>
+            <w:vAlign w:val="center"/>
+          </w:tcPr>
+          <w:p>
+            <w:pPr>
+              <w:spacing w:after="20" w:line="260"/>
+            </w:pPr>
+            <w:r>
+              <w:rPr>
+                <w:sz w:val="18"/>
+                <w:szCs w:val="18"/>
+              </w:rPr>
+              <w:t xml:space="preserve">operador</w:t>
             </w:r>
           </w:p>
         </w:tc>
@@ -13976,25 +13999,25 @@
               <w:bottom w:val="single" w:color="C9C2A8" w:sz="4"/>
               <w:right w:val="single" w:color="C9C2A8" w:sz="4"/>
             </w:tcBorders>
-            <w:shd w:fill="FFFFFF" w:color="auto" w:val="clear"/>
-            <w:tcMar>
-              <w:top w:type="dxa" w:w="60"/>
-              <w:left w:type="dxa" w:w="100"/>
-              <w:bottom w:type="dxa" w:w="60"/>
-              <w:right w:type="dxa" w:w="100"/>
-            </w:tcMar>
-            <w:vAlign w:val="center"/>
-          </w:tcPr>
-          <w:p>
-            <w:pPr>
-              <w:spacing w:after="20" w:line="260"/>
-            </w:pPr>
-            <w:r>
-              <w:rPr>
-                <w:sz w:val="18"/>
-                <w:szCs w:val="18"/>
-              </w:rPr>
-              <w:t xml:space="preserve">Restaurações (6)</w:t>
+            <w:shd w:fill="FBF9F1" w:color="auto" w:val="clear"/>
+            <w:tcMar>
+              <w:top w:type="dxa" w:w="60"/>
+              <w:left w:type="dxa" w:w="100"/>
+              <w:bottom w:type="dxa" w:w="60"/>
+              <w:right w:type="dxa" w:w="100"/>
+            </w:tcMar>
+            <w:vAlign w:val="center"/>
+          </w:tcPr>
+          <w:p>
+            <w:pPr>
+              <w:spacing w:after="20" w:line="260"/>
+            </w:pPr>
+            <w:r>
+              <w:rPr>
+                <w:sz w:val="18"/>
+                <w:szCs w:val="18"/>
+              </w:rPr>
+              <w:t xml:space="preserve">Exclusões (6)</w:t>
             </w:r>
           </w:p>
         </w:tc>
@@ -14007,7 +14030,7 @@
               <w:bottom w:val="single" w:color="C9C2A8" w:sz="4"/>
               <w:right w:val="single" w:color="C9C2A8" w:sz="4"/>
             </w:tcBorders>
-            <w:shd w:fill="FFFFFF" w:color="auto" w:val="clear"/>
+            <w:shd w:fill="FBF9F1" w:color="auto" w:val="clear"/>
             <w:tcMar>
               <w:top w:type="dxa" w:w="60"/>
               <w:left w:type="dxa" w:w="100"/>
@@ -14027,14 +14050,14 @@
                 <w:sz w:val="16"/>
                 <w:szCs w:val="16"/>
               </w:rPr>
-              <w:t xml:space="preserve">restaurar_&lt;entidade&gt;</w:t>
-            </w:r>
-            <w:r>
-              <w:rPr>
-                <w:sz w:val="18"/>
-                <w:szCs w:val="18"/>
-              </w:rPr>
-              <w:t xml:space="preserve">: tira da lixeira; exige senha de um admin no card</w:t>
+              <w:t xml:space="preserve">excluir_&lt;entidade&gt;</w:t>
+            </w:r>
+            <w:r>
+              <w:rPr>
+                <w:sz w:val="18"/>
+                <w:szCs w:val="18"/>
+              </w:rPr>
+              <w:t xml:space="preserve">: move para a lixeira se nada depender do registro</w:t>
             </w:r>
           </w:p>
         </w:tc>
@@ -14047,25 +14070,25 @@
               <w:bottom w:val="single" w:color="C9C2A8" w:sz="4"/>
               <w:right w:val="single" w:color="C9C2A8" w:sz="4"/>
             </w:tcBorders>
-            <w:shd w:fill="FFFFFF" w:color="auto" w:val="clear"/>
-            <w:tcMar>
-              <w:top w:type="dxa" w:w="60"/>
-              <w:left w:type="dxa" w:w="100"/>
-              <w:bottom w:type="dxa" w:w="60"/>
-              <w:right w:type="dxa" w:w="100"/>
-            </w:tcMar>
-            <w:vAlign w:val="center"/>
-          </w:tcPr>
-          <w:p>
-            <w:pPr>
-              <w:spacing w:after="20" w:line="260"/>
-            </w:pPr>
-            <w:r>
-              <w:rPr>
-                <w:sz w:val="18"/>
-                <w:szCs w:val="18"/>
-              </w:rPr>
-              <w:t xml:space="preserve">escrita</w:t>
+            <w:shd w:fill="FBF9F1" w:color="auto" w:val="clear"/>
+            <w:tcMar>
+              <w:top w:type="dxa" w:w="60"/>
+              <w:left w:type="dxa" w:w="100"/>
+              <w:bottom w:type="dxa" w:w="60"/>
+              <w:right w:type="dxa" w:w="100"/>
+            </w:tcMar>
+            <w:vAlign w:val="center"/>
+          </w:tcPr>
+          <w:p>
+            <w:pPr>
+              <w:spacing w:after="20" w:line="260"/>
+            </w:pPr>
+            <w:r>
+              <w:rPr>
+                <w:sz w:val="18"/>
+                <w:szCs w:val="18"/>
+              </w:rPr>
+              <w:t xml:space="preserve">exclusão</w:t>
             </w:r>
           </w:p>
         </w:tc>
@@ -14078,25 +14101,25 @@
               <w:bottom w:val="single" w:color="C9C2A8" w:sz="4"/>
               <w:right w:val="single" w:color="C9C2A8" w:sz="4"/>
             </w:tcBorders>
-            <w:shd w:fill="FFFFFF" w:color="auto" w:val="clear"/>
-            <w:tcMar>
-              <w:top w:type="dxa" w:w="60"/>
-              <w:left w:type="dxa" w:w="100"/>
-              <w:bottom w:type="dxa" w:w="60"/>
-              <w:right w:type="dxa" w:w="100"/>
-            </w:tcMar>
-            <w:vAlign w:val="center"/>
-          </w:tcPr>
-          <w:p>
-            <w:pPr>
-              <w:spacing w:after="20" w:line="260"/>
-            </w:pPr>
-            <w:r>
-              <w:rPr>
-                <w:sz w:val="18"/>
-                <w:szCs w:val="18"/>
-              </w:rPr>
-              <w:t xml:space="preserve">operador (funcionário: admin)</w:t>
+            <w:shd w:fill="FBF9F1" w:color="auto" w:val="clear"/>
+            <w:tcMar>
+              <w:top w:type="dxa" w:w="60"/>
+              <w:left w:type="dxa" w:w="100"/>
+              <w:bottom w:type="dxa" w:w="60"/>
+              <w:right w:type="dxa" w:w="100"/>
+            </w:tcMar>
+            <w:vAlign w:val="center"/>
+          </w:tcPr>
+          <w:p>
+            <w:pPr>
+              <w:spacing w:after="20" w:line="260"/>
+            </w:pPr>
+            <w:r>
+              <w:rPr>
+                <w:sz w:val="18"/>
+                <w:szCs w:val="18"/>
+              </w:rPr>
+              <w:t xml:space="preserve">admin</w:t>
             </w:r>
           </w:p>
         </w:tc>
@@ -14114,25 +14137,25 @@
               <w:bottom w:val="single" w:color="C9C2A8" w:sz="4"/>
               <w:right w:val="single" w:color="C9C2A8" w:sz="4"/>
             </w:tcBorders>
-            <w:shd w:fill="FBF9F1" w:color="auto" w:val="clear"/>
-            <w:tcMar>
-              <w:top w:type="dxa" w:w="60"/>
-              <w:left w:type="dxa" w:w="100"/>
-              <w:bottom w:type="dxa" w:w="60"/>
-              <w:right w:type="dxa" w:w="100"/>
-            </w:tcMar>
-            <w:vAlign w:val="center"/>
-          </w:tcPr>
-          <w:p>
-            <w:pPr>
-              <w:spacing w:after="20" w:line="260"/>
-            </w:pPr>
-            <w:r>
-              <w:rPr>
-                <w:sz w:val="18"/>
-                <w:szCs w:val="18"/>
-              </w:rPr>
-              <w:t xml:space="preserve">Exclusões definitivas (6)</w:t>
+            <w:shd w:fill="FFFFFF" w:color="auto" w:val="clear"/>
+            <w:tcMar>
+              <w:top w:type="dxa" w:w="60"/>
+              <w:left w:type="dxa" w:w="100"/>
+              <w:bottom w:type="dxa" w:w="60"/>
+              <w:right w:type="dxa" w:w="100"/>
+            </w:tcMar>
+            <w:vAlign w:val="center"/>
+          </w:tcPr>
+          <w:p>
+            <w:pPr>
+              <w:spacing w:after="20" w:line="260"/>
+            </w:pPr>
+            <w:r>
+              <w:rPr>
+                <w:sz w:val="18"/>
+                <w:szCs w:val="18"/>
+              </w:rPr>
+              <w:t xml:space="preserve">Restaurações (6)</w:t>
             </w:r>
           </w:p>
         </w:tc>
@@ -14145,7 +14168,7 @@
               <w:bottom w:val="single" w:color="C9C2A8" w:sz="4"/>
               <w:right w:val="single" w:color="C9C2A8" w:sz="4"/>
             </w:tcBorders>
-            <w:shd w:fill="FBF9F1" w:color="auto" w:val="clear"/>
+            <w:shd w:fill="FFFFFF" w:color="auto" w:val="clear"/>
             <w:tcMar>
               <w:top w:type="dxa" w:w="60"/>
               <w:left w:type="dxa" w:w="100"/>
@@ -14165,6 +14188,144 @@
                 <w:sz w:val="16"/>
                 <w:szCs w:val="16"/>
               </w:rPr>
+              <w:t xml:space="preserve">restaurar_&lt;entidade&gt;</w:t>
+            </w:r>
+            <w:r>
+              <w:rPr>
+                <w:sz w:val="18"/>
+                <w:szCs w:val="18"/>
+              </w:rPr>
+              <w:t xml:space="preserve">: tira da lixeira; exige senha de um admin no card</w:t>
+            </w:r>
+          </w:p>
+        </w:tc>
+        <w:tc>
+          <w:tcPr>
+            <w:tcW w:type="dxa" w:w="1089"/>
+            <w:tcBorders>
+              <w:top w:val="single" w:color="C9C2A8" w:sz="4"/>
+              <w:left w:val="single" w:color="C9C2A8" w:sz="4"/>
+              <w:bottom w:val="single" w:color="C9C2A8" w:sz="4"/>
+              <w:right w:val="single" w:color="C9C2A8" w:sz="4"/>
+            </w:tcBorders>
+            <w:shd w:fill="FFFFFF" w:color="auto" w:val="clear"/>
+            <w:tcMar>
+              <w:top w:type="dxa" w:w="60"/>
+              <w:left w:type="dxa" w:w="100"/>
+              <w:bottom w:type="dxa" w:w="60"/>
+              <w:right w:type="dxa" w:w="100"/>
+            </w:tcMar>
+            <w:vAlign w:val="center"/>
+          </w:tcPr>
+          <w:p>
+            <w:pPr>
+              <w:spacing w:after="20" w:line="260"/>
+            </w:pPr>
+            <w:r>
+              <w:rPr>
+                <w:sz w:val="18"/>
+                <w:szCs w:val="18"/>
+              </w:rPr>
+              <w:t xml:space="preserve">escrita</w:t>
+            </w:r>
+          </w:p>
+        </w:tc>
+        <w:tc>
+          <w:tcPr>
+            <w:tcW w:type="dxa" w:w="1814"/>
+            <w:tcBorders>
+              <w:top w:val="single" w:color="C9C2A8" w:sz="4"/>
+              <w:left w:val="single" w:color="C9C2A8" w:sz="4"/>
+              <w:bottom w:val="single" w:color="C9C2A8" w:sz="4"/>
+              <w:right w:val="single" w:color="C9C2A8" w:sz="4"/>
+            </w:tcBorders>
+            <w:shd w:fill="FFFFFF" w:color="auto" w:val="clear"/>
+            <w:tcMar>
+              <w:top w:type="dxa" w:w="60"/>
+              <w:left w:type="dxa" w:w="100"/>
+              <w:bottom w:type="dxa" w:w="60"/>
+              <w:right w:type="dxa" w:w="100"/>
+            </w:tcMar>
+            <w:vAlign w:val="center"/>
+          </w:tcPr>
+          <w:p>
+            <w:pPr>
+              <w:spacing w:after="20" w:line="260"/>
+            </w:pPr>
+            <w:r>
+              <w:rPr>
+                <w:sz w:val="18"/>
+                <w:szCs w:val="18"/>
+              </w:rPr>
+              <w:t xml:space="preserve">operador (funcionário: admin)</w:t>
+            </w:r>
+          </w:p>
+        </w:tc>
+      </w:tr>
+      <w:tr>
+        <w:trPr>
+          <w:cantSplit/>
+        </w:trPr>
+        <w:tc>
+          <w:tcPr>
+            <w:tcW w:type="dxa" w:w="1451"/>
+            <w:tcBorders>
+              <w:top w:val="single" w:color="C9C2A8" w:sz="4"/>
+              <w:left w:val="single" w:color="C9C2A8" w:sz="4"/>
+              <w:bottom w:val="single" w:color="C9C2A8" w:sz="4"/>
+              <w:right w:val="single" w:color="C9C2A8" w:sz="4"/>
+            </w:tcBorders>
+            <w:shd w:fill="FBF9F1" w:color="auto" w:val="clear"/>
+            <w:tcMar>
+              <w:top w:type="dxa" w:w="60"/>
+              <w:left w:type="dxa" w:w="100"/>
+              <w:bottom w:type="dxa" w:w="60"/>
+              <w:right w:type="dxa" w:w="100"/>
+            </w:tcMar>
+            <w:vAlign w:val="center"/>
+          </w:tcPr>
+          <w:p>
+            <w:pPr>
+              <w:spacing w:after="20" w:line="260"/>
+            </w:pPr>
+            <w:r>
+              <w:rPr>
+                <w:sz w:val="18"/>
+                <w:szCs w:val="18"/>
+              </w:rPr>
+              <w:t xml:space="preserve">Exclusões definitivas (6)</w:t>
+            </w:r>
+          </w:p>
+        </w:tc>
+        <w:tc>
+          <w:tcPr>
+            <w:tcW w:type="dxa" w:w="4717"/>
+            <w:tcBorders>
+              <w:top w:val="single" w:color="C9C2A8" w:sz="4"/>
+              <w:left w:val="single" w:color="C9C2A8" w:sz="4"/>
+              <w:bottom w:val="single" w:color="C9C2A8" w:sz="4"/>
+              <w:right w:val="single" w:color="C9C2A8" w:sz="4"/>
+            </w:tcBorders>
+            <w:shd w:fill="FBF9F1" w:color="auto" w:val="clear"/>
+            <w:tcMar>
+              <w:top w:type="dxa" w:w="60"/>
+              <w:left w:type="dxa" w:w="100"/>
+              <w:bottom w:type="dxa" w:w="60"/>
+              <w:right w:type="dxa" w:w="100"/>
+            </w:tcMar>
+            <w:vAlign w:val="center"/>
+          </w:tcPr>
+          <w:p>
+            <w:pPr>
+              <w:spacing w:after="20" w:line="260"/>
+            </w:pPr>
+            <w:r>
+              <w:rPr>
+                <w:rFonts w:ascii="Consolas" w:cs="Consolas" w:eastAsia="Consolas" w:hAnsi="Consolas"/>
+                <w:color w:val="2E5B85"/>
+                <w:sz w:val="16"/>
+                <w:szCs w:val="16"/>
+              </w:rPr>
               <w:t xml:space="preserve">excluir_definitivo_&lt;entidade&gt;</w:t>
             </w:r>
             <w:r>
@@ -14288,7 +14449,7 @@
       <w:r>
         <w:drawing>
           <wp:inline distT="0" distB="0" distL="0" distR="0">
-            <wp:extent cx="5762625" cy="1600200"/>
+            <wp:extent cx="5760720" cy="1596657"/>
             <wp:effectExtent t="0" r="0" b="0" l="0"/>
             <wp:docPr id="1" name="13_fronteira_ia.png" descr="Fronteira de dados entre o Sentinel e o provedor de IA." title="Figura 5"/>
             <wp:cNvGraphicFramePr>
@@ -14313,7 +14474,7 @@
                   <pic:spPr bwMode="auto">
                     <a:xfrm>
                       <a:off x="0" y="0"/>
-                      <a:ext cx="5762625" cy="1600200"/>
+                      <a:ext cx="5760720" cy="1596657"/>
                     </a:xfrm>
                     <a:prstGeom prst="rect">
                       <a:avLst/>
@@ -15966,7 +16127,7 @@
       <w:r>
         <w:drawing>
           <wp:inline distT="0" distB="0" distL="0" distR="0">
-            <wp:extent cx="3695700" cy="7315200"/>
+            <wp:extent cx="3692743" cy="7315200"/>
             <wp:effectExtent t="0" r="0" b="0" l="0"/>
             <wp:docPr id="1" name="05_f1_fluxo.png" descr="F1: comando, proposta, Revisar, segurar e confirmar." title="Figura 6"/>
             <wp:cNvGraphicFramePr>
@@ -15991,7 +16152,7 @@
                   <pic:spPr bwMode="auto">
                     <a:xfrm>
                       <a:off x="0" y="0"/>
-                      <a:ext cx="3695700" cy="7315200"/>
+                      <a:ext cx="3692743" cy="7315200"/>
                     </a:xfrm>
                     <a:prstGeom prst="rect">
                       <a:avLst/>
@@ -29737,7 +29898,7 @@
       <w:r>
         <w:drawing>
           <wp:inline distT="0" distB="0" distL="0" distR="0">
-            <wp:extent cx="5762625" cy="4467225"/>
+            <wp:extent cx="5760720" cy="4528885"/>
             <wp:effectExtent t="0" r="0" b="0" l="0"/>
             <wp:docPr id="1" name="12_dados.png" descr="Modelo de dados: entidades de domínio, usuários e auditoria." title="Figura 14"/>
             <wp:cNvGraphicFramePr>
@@ -29762,7 +29923,7 @@
                   <pic:spPr bwMode="auto">
                     <a:xfrm>
                       <a:off x="0" y="0"/>
-                      <a:ext cx="5762625" cy="4467225"/>
+                      <a:ext cx="5760720" cy="4528885"/>
                     </a:xfrm>
                     <a:prstGeom prst="rect">
                       <a:avLst/>
@@ -31630,6 +31791,75 @@
               <w:bottom w:val="single" w:color="C9C2A8" w:sz="4"/>
               <w:right w:val="single" w:color="C9C2A8" w:sz="4"/>
             </w:tcBorders>
+            <w:shd w:fill="FBF9F1" w:color="auto" w:val="clear"/>
+            <w:tcMar>
+              <w:top w:type="dxa" w:w="60"/>
+              <w:left w:type="dxa" w:w="100"/>
+              <w:bottom w:type="dxa" w:w="60"/>
+              <w:right w:type="dxa" w:w="100"/>
+            </w:tcMar>
+            <w:vAlign w:val="center"/>
+          </w:tcPr>
+          <w:p>
+            <w:pPr>
+              <w:spacing w:after="20" w:line="260"/>
+            </w:pPr>
+            <w:r>
+              <w:rPr>
+                <w:rFonts w:ascii="Consolas" w:cs="Consolas" w:eastAsia="Consolas" w:hAnsi="Consolas"/>
+                <w:color w:val="2E5B85"/>
+                <w:sz w:val="14"/>
+                <w:szCs w:val="14"/>
+              </w:rPr>
+              <w:t xml:space="preserve">lote_id</w:t>
+            </w:r>
+          </w:p>
+        </w:tc>
+        <w:tc>
+          <w:tcPr>
+            <w:tcW w:type="dxa" w:w="6350"/>
+            <w:tcBorders>
+              <w:top w:val="single" w:color="C9C2A8" w:sz="4"/>
+              <w:left w:val="single" w:color="C9C2A8" w:sz="4"/>
+              <w:bottom w:val="single" w:color="C9C2A8" w:sz="4"/>
+              <w:right w:val="single" w:color="C9C2A8" w:sz="4"/>
+            </w:tcBorders>
+            <w:shd w:fill="FBF9F1" w:color="auto" w:val="clear"/>
+            <w:tcMar>
+              <w:top w:type="dxa" w:w="60"/>
+              <w:left w:type="dxa" w:w="100"/>
+              <w:bottom w:type="dxa" w:w="60"/>
+              <w:right w:type="dxa" w:w="100"/>
+            </w:tcMar>
+            <w:vAlign w:val="center"/>
+          </w:tcPr>
+          <w:p>
+            <w:pPr>
+              <w:spacing w:after="20" w:line="260"/>
+            </w:pPr>
+            <w:r>
+              <w:rPr>
+                <w:sz w:val="18"/>
+                <w:szCs w:val="18"/>
+              </w:rPr>
+              <w:t xml:space="preserve">Identificador comum às linhas de um mesmo lote do RF03 (UUID; nulo fora de lote)</w:t>
+            </w:r>
+          </w:p>
+        </w:tc>
+      </w:tr>
+      <w:tr>
+        <w:trPr>
+          <w:cantSplit/>
+        </w:trPr>
+        <w:tc>
+          <w:tcPr>
+            <w:tcW w:type="dxa" w:w="2721"/>
+            <w:tcBorders>
+              <w:top w:val="single" w:color="C9C2A8" w:sz="4"/>
+              <w:left w:val="single" w:color="C9C2A8" w:sz="4"/>
+              <w:bottom w:val="single" w:color="C9C2A8" w:sz="4"/>
+              <w:right w:val="single" w:color="C9C2A8" w:sz="4"/>
+            </w:tcBorders>
             <w:shd w:fill="FFFFFF" w:color="auto" w:val="clear"/>
             <w:tcMar>
               <w:top w:type="dxa" w:w="60"/>
@@ -33335,6 +33565,106 @@
           </w:p>
         </w:tc>
       </w:tr>
+      <w:tr>
+        <w:trPr>
+          <w:cantSplit/>
+        </w:trPr>
+        <w:tc>
+          <w:tcPr>
+            <w:tcW w:type="dxa" w:w="726"/>
+            <w:tcBorders>
+              <w:top w:val="single" w:color="C9C2A8" w:sz="4"/>
+              <w:left w:val="single" w:color="C9C2A8" w:sz="4"/>
+              <w:bottom w:val="single" w:color="C9C2A8" w:sz="4"/>
+              <w:right w:val="single" w:color="C9C2A8" w:sz="4"/>
+            </w:tcBorders>
+            <w:shd w:fill="FFFFFF" w:color="auto" w:val="clear"/>
+            <w:tcMar>
+              <w:top w:type="dxa" w:w="60"/>
+              <w:left w:type="dxa" w:w="100"/>
+              <w:bottom w:type="dxa" w:w="60"/>
+              <w:right w:type="dxa" w:w="100"/>
+            </w:tcMar>
+            <w:vAlign w:val="center"/>
+          </w:tcPr>
+          <w:p>
+            <w:pPr>
+              <w:spacing w:after="20" w:line="260"/>
+            </w:pPr>
+            <w:r>
+              <w:rPr>
+                <w:sz w:val="18"/>
+                <w:szCs w:val="18"/>
+              </w:rPr>
+              <w:t xml:space="preserve">16</w:t>
+            </w:r>
+          </w:p>
+        </w:tc>
+        <w:tc>
+          <w:tcPr>
+            <w:tcW w:type="dxa" w:w="4717"/>
+            <w:tcBorders>
+              <w:top w:val="single" w:color="C9C2A8" w:sz="4"/>
+              <w:left w:val="single" w:color="C9C2A8" w:sz="4"/>
+              <w:bottom w:val="single" w:color="C9C2A8" w:sz="4"/>
+              <w:right w:val="single" w:color="C9C2A8" w:sz="4"/>
+            </w:tcBorders>
+            <w:shd w:fill="FFFFFF" w:color="auto" w:val="clear"/>
+            <w:tcMar>
+              <w:top w:type="dxa" w:w="60"/>
+              <w:left w:type="dxa" w:w="100"/>
+              <w:bottom w:type="dxa" w:w="60"/>
+              <w:right w:type="dxa" w:w="100"/>
+            </w:tcMar>
+            <w:vAlign w:val="center"/>
+          </w:tcPr>
+          <w:p>
+            <w:pPr>
+              <w:spacing w:after="20" w:line="260"/>
+            </w:pPr>
+            <w:r>
+              <w:rPr>
+                <w:rFonts w:ascii="Consolas" w:cs="Consolas" w:eastAsia="Consolas" w:hAnsi="Consolas"/>
+                <w:color w:val="2E5B85"/>
+                <w:sz w:val="14"/>
+                <w:szCs w:val="14"/>
+              </w:rPr>
+              <w:t xml:space="preserve">add_lote_id_to_audit_logs_table</w:t>
+            </w:r>
+          </w:p>
+        </w:tc>
+        <w:tc>
+          <w:tcPr>
+            <w:tcW w:type="dxa" w:w="3628"/>
+            <w:tcBorders>
+              <w:top w:val="single" w:color="C9C2A8" w:sz="4"/>
+              <w:left w:val="single" w:color="C9C2A8" w:sz="4"/>
+              <w:bottom w:val="single" w:color="C9C2A8" w:sz="4"/>
+              <w:right w:val="single" w:color="C9C2A8" w:sz="4"/>
+            </w:tcBorders>
+            <w:shd w:fill="FFFFFF" w:color="auto" w:val="clear"/>
+            <w:tcMar>
+              <w:top w:type="dxa" w:w="60"/>
+              <w:left w:type="dxa" w:w="100"/>
+              <w:bottom w:type="dxa" w:w="60"/>
+              <w:right w:type="dxa" w:w="100"/>
+            </w:tcMar>
+            <w:vAlign w:val="center"/>
+          </w:tcPr>
+          <w:p>
+            <w:pPr>
+              <w:spacing w:after="20" w:line="260"/>
+            </w:pPr>
+            <w:r>
+              <w:rPr>
+                <w:sz w:val="18"/>
+                <w:szCs w:val="18"/>
+              </w:rPr>
+              <w:t xml:space="preserve">Identificador de lote na auditoria, indexado (RF03)</w:t>
+            </w:r>
+          </w:p>
+        </w:tc>
+      </w:tr>
     </w:tbl>
     <w:p>
       <w:pPr>
@@ -34569,7 +34899,7 @@
           <w:sz w:val="18"/>
           <w:szCs w:val="18"/>
         </w:rPr>
-        <w:t xml:space="preserve">Tabela 22 — Testes automatizados por arquivo (343 métodos; 398 casos com os conjuntos de dados)</w:t>
+        <w:t xml:space="preserve">Tabela 22 — Testes automatizados por arquivo (359 métodos; 414 casos com os conjuntos de dados)</w:t>
       </w:r>
     </w:p>
     <w:tbl>
@@ -35392,6 +35722,106 @@
                 <w:szCs w:val="17"/>
               </w:rPr>
               <w:t xml:space="preserve">Consulta da auditoria: só admin, por tenant, filtros, detalhe mascarado</w:t>
+            </w:r>
+          </w:p>
+        </w:tc>
+      </w:tr>
+      <w:tr>
+        <w:trPr>
+          <w:cantSplit/>
+        </w:trPr>
+        <w:tc>
+          <w:tcPr>
+            <w:tcW w:type="dxa" w:w="2903"/>
+            <w:tcBorders>
+              <w:top w:val="single" w:color="C9C2A8" w:sz="4"/>
+              <w:left w:val="single" w:color="C9C2A8" w:sz="4"/>
+              <w:bottom w:val="single" w:color="C9C2A8" w:sz="4"/>
+              <w:right w:val="single" w:color="C9C2A8" w:sz="4"/>
+            </w:tcBorders>
+            <w:shd w:fill="FBF9F1" w:color="auto" w:val="clear"/>
+            <w:tcMar>
+              <w:top w:type="dxa" w:w="60"/>
+              <w:left w:type="dxa" w:w="100"/>
+              <w:bottom w:type="dxa" w:w="60"/>
+              <w:right w:type="dxa" w:w="100"/>
+            </w:tcMar>
+            <w:vAlign w:val="center"/>
+          </w:tcPr>
+          <w:p>
+            <w:pPr>
+              <w:spacing w:after="20" w:line="260"/>
+            </w:pPr>
+            <w:r>
+              <w:rPr>
+                <w:rFonts w:ascii="Consolas" w:cs="Consolas" w:eastAsia="Consolas" w:hAnsi="Consolas"/>
+                <w:color w:val="2E5B85"/>
+                <w:sz w:val="13"/>
+                <w:szCs w:val="13"/>
+              </w:rPr>
+              <w:t xml:space="preserve">ConciliarLoteTest</w:t>
+            </w:r>
+          </w:p>
+        </w:tc>
+        <w:tc>
+          <w:tcPr>
+            <w:tcW w:type="dxa" w:w="1089"/>
+            <w:tcBorders>
+              <w:top w:val="single" w:color="C9C2A8" w:sz="4"/>
+              <w:left w:val="single" w:color="C9C2A8" w:sz="4"/>
+              <w:bottom w:val="single" w:color="C9C2A8" w:sz="4"/>
+              <w:right w:val="single" w:color="C9C2A8" w:sz="4"/>
+            </w:tcBorders>
+            <w:shd w:fill="FBF9F1" w:color="auto" w:val="clear"/>
+            <w:tcMar>
+              <w:top w:type="dxa" w:w="60"/>
+              <w:left w:type="dxa" w:w="100"/>
+              <w:bottom w:type="dxa" w:w="60"/>
+              <w:right w:type="dxa" w:w="100"/>
+            </w:tcMar>
+            <w:vAlign w:val="center"/>
+          </w:tcPr>
+          <w:p>
+            <w:pPr>
+              <w:spacing w:after="20" w:line="260"/>
+            </w:pPr>
+            <w:r>
+              <w:rPr>
+                <w:sz w:val="17"/>
+                <w:szCs w:val="17"/>
+              </w:rPr>
+              <w:t xml:space="preserve">16</w:t>
+            </w:r>
+          </w:p>
+        </w:tc>
+        <w:tc>
+          <w:tcPr>
+            <w:tcW w:type="dxa" w:w="5079"/>
+            <w:tcBorders>
+              <w:top w:val="single" w:color="C9C2A8" w:sz="4"/>
+              <w:left w:val="single" w:color="C9C2A8" w:sz="4"/>
+              <w:bottom w:val="single" w:color="C9C2A8" w:sz="4"/>
+              <w:right w:val="single" w:color="C9C2A8" w:sz="4"/>
+            </w:tcBorders>
+            <w:shd w:fill="FBF9F1" w:color="auto" w:val="clear"/>
+            <w:tcMar>
+              <w:top w:type="dxa" w:w="60"/>
+              <w:left w:type="dxa" w:w="100"/>
+              <w:bottom w:type="dxa" w:w="60"/>
+              <w:right w:type="dxa" w:w="100"/>
+            </w:tcMar>
+            <w:vAlign w:val="center"/>
+          </w:tcPr>
+          <w:p>
+            <w:pPr>
+              <w:spacing w:after="20" w:line="260"/>
+            </w:pPr>
+            <w:r>
+              <w:rPr>
+                <w:sz w:val="17"/>
+                <w:szCs w:val="17"/>
+              </w:rPr>
+              <w:t xml:space="preserve">RF03: lista congelada, teto de 25, valores forjados ignorados, Revisar item a item, rollback, outro tenant, trava, token reutilizado, auditoria por item</w:t>
             </w:r>
           </w:p>
         </w:tc>
@@ -36898,7 +37328,7 @@
                 <w:sz w:val="16"/>
                 <w:szCs w:val="16"/>
               </w:rPr>
-              <w:t xml:space="preserve">, catálogo de 37 tools · </w:t>
+              <w:t xml:space="preserve">, catálogo de 38 tools · </w:t>
             </w:r>
             <w:r>
               <w:rPr>
@@ -37175,7 +37605,7 @@
               <w:bottom w:val="single" w:color="C9C2A8" w:sz="4"/>
               <w:right w:val="single" w:color="C9C2A8" w:sz="4"/>
             </w:tcBorders>
-            <w:shd w:fill="EEF3F9" w:color="auto" w:val="clear"/>
+            <w:shd w:fill="FFFFFF" w:color="auto" w:val="clear"/>
             <w:tcMar>
               <w:top w:type="dxa" w:w="60"/>
               <w:left w:type="dxa" w:w="100"/>
@@ -37206,7 +37636,7 @@
               <w:bottom w:val="single" w:color="C9C2A8" w:sz="4"/>
               <w:right w:val="single" w:color="C9C2A8" w:sz="4"/>
             </w:tcBorders>
-            <w:shd w:fill="EEF3F9" w:color="auto" w:val="clear"/>
+            <w:shd w:fill="FFFFFF" w:color="auto" w:val="clear"/>
             <w:tcMar>
               <w:top w:type="dxa" w:w="60"/>
               <w:left w:type="dxa" w:w="100"/>
@@ -37237,7 +37667,7 @@
               <w:bottom w:val="single" w:color="C9C2A8" w:sz="4"/>
               <w:right w:val="single" w:color="C9C2A8" w:sz="4"/>
             </w:tcBorders>
-            <w:shd w:fill="EEF3F9" w:color="auto" w:val="clear"/>
+            <w:shd w:fill="FFFFFF" w:color="auto" w:val="clear"/>
             <w:tcMar>
               <w:top w:type="dxa" w:w="60"/>
               <w:left w:type="dxa" w:w="100"/>
@@ -37255,7 +37685,7 @@
                 <w:sz w:val="16"/>
                 <w:szCs w:val="16"/>
               </w:rPr>
-              <w:t xml:space="preserve">Especificado (13.3)</w:t>
+              <w:t xml:space="preserve">Feito</w:t>
             </w:r>
           </w:p>
         </w:tc>
@@ -37268,26 +37698,19 @@
               <w:bottom w:val="single" w:color="C9C2A8" w:sz="4"/>
               <w:right w:val="single" w:color="C9C2A8" w:sz="4"/>
             </w:tcBorders>
-            <w:shd w:fill="EEF3F9" w:color="auto" w:val="clear"/>
-            <w:tcMar>
-              <w:top w:type="dxa" w:w="60"/>
-              <w:left w:type="dxa" w:w="100"/>
-              <w:bottom w:type="dxa" w:w="60"/>
-              <w:right w:type="dxa" w:w="100"/>
-            </w:tcMar>
-            <w:vAlign w:val="center"/>
-          </w:tcPr>
-          <w:p>
-            <w:pPr>
-              <w:spacing w:after="20" w:line="260"/>
-            </w:pPr>
-            <w:r>
-              <w:rPr>
-                <w:sz w:val="16"/>
-                <w:szCs w:val="16"/>
-              </w:rPr>
-              <w:t xml:space="preserve">Hoje toda escrita é unitária e confirmada; vários pedidos numa mensagem: só o primeiro é atendido, com aviso · </w:t>
-            </w:r>
+            <w:shd w:fill="FFFFFF" w:color="auto" w:val="clear"/>
+            <w:tcMar>
+              <w:top w:type="dxa" w:w="60"/>
+              <w:left w:type="dxa" w:w="100"/>
+              <w:bottom w:type="dxa" w:w="60"/>
+              <w:right w:type="dxa" w:w="100"/>
+            </w:tcMar>
+            <w:vAlign w:val="center"/>
+          </w:tcPr>
+          <w:p>
+            <w:pPr>
+              <w:spacing w:after="20" w:line="260"/>
+            </w:pPr>
             <w:r>
               <w:rPr>
                 <w:rFonts w:ascii="Consolas" w:cs="Consolas" w:eastAsia="Consolas" w:hAnsi="Consolas"/>
@@ -37295,7 +37718,94 @@
                 <w:sz w:val="14"/>
                 <w:szCs w:val="14"/>
               </w:rPr>
-              <w:t xml:space="preserve">test_varios_pedidos_numa_mensagem_so_o_primeiro_e_feito_e_a_resposta_avisa</w:t>
+              <w:t xml:space="preserve">conciliar_lancamentos_em_lote</w:t>
+            </w:r>
+            <w:r>
+              <w:rPr>
+                <w:sz w:val="16"/>
+                <w:szCs w:val="16"/>
+              </w:rPr>
+              <w:t xml:space="preserve">, </w:t>
+            </w:r>
+            <w:r>
+              <w:rPr>
+                <w:rFonts w:ascii="Consolas" w:cs="Consolas" w:eastAsia="Consolas" w:hAnsi="Consolas"/>
+                <w:color w:val="2E5B85"/>
+                <w:sz w:val="14"/>
+                <w:szCs w:val="14"/>
+              </w:rPr>
+              <w:t xml:space="preserve">resolverLote()</w:t>
+            </w:r>
+            <w:r>
+              <w:rPr>
+                <w:sz w:val="16"/>
+                <w:szCs w:val="16"/>
+              </w:rPr>
+              <w:t xml:space="preserve">, </w:t>
+            </w:r>
+            <w:r>
+              <w:rPr>
+                <w:rFonts w:ascii="Consolas" w:cs="Consolas" w:eastAsia="Consolas" w:hAnsi="Consolas"/>
+                <w:color w:val="2E5B85"/>
+                <w:sz w:val="14"/>
+                <w:szCs w:val="14"/>
+              </w:rPr>
+              <w:t xml:space="preserve">LancamentoService::conciliarLote()</w:t>
+            </w:r>
+            <w:r>
+              <w:rPr>
+                <w:sz w:val="16"/>
+                <w:szCs w:val="16"/>
+              </w:rPr>
+              <w:t xml:space="preserve"> (</w:t>
+            </w:r>
+            <w:r>
+              <w:rPr>
+                <w:rFonts w:ascii="Consolas" w:cs="Consolas" w:eastAsia="Consolas" w:hAnsi="Consolas"/>
+                <w:color w:val="2E5B85"/>
+                <w:sz w:val="14"/>
+                <w:szCs w:val="14"/>
+              </w:rPr>
+              <w:t xml:space="preserve">lockForUpdate</w:t>
+            </w:r>
+            <w:r>
+              <w:rPr>
+                <w:sz w:val="16"/>
+                <w:szCs w:val="16"/>
+              </w:rPr>
+              <w:t xml:space="preserve">), </w:t>
+            </w:r>
+            <w:r>
+              <w:rPr>
+                <w:rFonts w:ascii="Consolas" w:cs="Consolas" w:eastAsia="Consolas" w:hAnsi="Consolas"/>
+                <w:color w:val="2E5B85"/>
+                <w:sz w:val="14"/>
+                <w:szCs w:val="14"/>
+              </w:rPr>
+              <w:t xml:space="preserve">lote_id</w:t>
+            </w:r>
+            <w:r>
+              <w:rPr>
+                <w:sz w:val="16"/>
+                <w:szCs w:val="16"/>
+              </w:rPr>
+              <w:t xml:space="preserve"> · </w:t>
+            </w:r>
+            <w:r>
+              <w:rPr>
+                <w:rFonts w:ascii="Consolas" w:cs="Consolas" w:eastAsia="Consolas" w:hAnsi="Consolas"/>
+                <w:color w:val="2E5B85"/>
+                <w:sz w:val="14"/>
+                <w:szCs w:val="14"/>
+              </w:rPr>
+              <w:t xml:space="preserve">ConciliarLoteTest</w:t>
+            </w:r>
+            <w:r>
+              <w:rPr>
+                <w:sz w:val="16"/>
+                <w:szCs w:val="16"/>
+              </w:rPr>
+              <w:t xml:space="preserve"> (16)</w:t>
             </w:r>
           </w:p>
         </w:tc>
@@ -40484,7 +40994,7 @@
                 <w:sz w:val="16"/>
                 <w:szCs w:val="16"/>
               </w:rPr>
-              <w:t xml:space="preserve">398 casos; arquivos de governança listados na seção 12</w:t>
+              <w:t xml:space="preserve">414 casos; arquivos de governança listados na seção 12</w:t>
             </w:r>
           </w:p>
         </w:tc>
@@ -40663,7 +41173,7 @@
         <w:jc w:val="both"/>
       </w:pPr>
       <w:r>
-        <w:t xml:space="preserve">Na construção, toda escrita ficou unitária: um registro por vez, sempre com Revisar e segurar. Para atender ao RF03 sem abrir mão das garantias, a equipe especificou o padrão </w:t>
+        <w:t xml:space="preserve">Na construção, toda escrita ficou unitária: um registro por vez, sempre com Revisar e segurar. Para atender ao RF03 sem abrir mão das garantias, a equipe adotou o padrão </w:t>
       </w:r>
       <w:r>
         <w:rPr>
@@ -40673,7 +41183,7 @@
         <w:t xml:space="preserve">planejar → o humano aprova → executar</w:t>
       </w:r>
       <w:r>
-        <w:t xml:space="preserve">: o agente apresenta um plano listando cada ação e o impacto, e só depois da aprovação explícita o sistema executa.</w:t>
+        <w:t xml:space="preserve">: o agente apresenta um plano listando cada item e o impacto, e só depois da aprovação explícita o sistema executa, tudo ou nada.</w:t>
       </w:r>
     </w:p>
     <w:tbl>
@@ -40700,11 +41210,11 @@
             <w:tcW w:type="dxa" w:w="9071"/>
             <w:tcBorders>
               <w:top w:val="none" w:color="FFFFFF" w:sz="0"/>
-              <w:left w:val="single" w:color="8A5A12" w:sz="24"/>
+              <w:left w:val="single" w:color="2F6B4F" w:sz="24"/>
               <w:bottom w:val="none" w:color="FFFFFF" w:sz="0"/>
               <w:right w:val="none" w:color="FFFFFF" w:sz="0"/>
             </w:tcBorders>
-            <w:shd w:fill="F6EBD0" w:color="auto" w:val="clear"/>
+            <w:shd w:fill="E4EFE6" w:color="auto" w:val="clear"/>
             <w:tcMar>
               <w:top w:type="dxa" w:w="120"/>
               <w:left w:type="dxa" w:w="180"/>
@@ -40720,7 +41230,7 @@
               <w:rPr>
                 <w:b/>
                 <w:bCs/>
-                <w:color w:val="8A5A12"/>
+                <w:color w:val="2F6B4F"/>
                 <w:sz w:val="20"/>
                 <w:szCs w:val="20"/>
               </w:rPr>
@@ -40736,7 +41246,39 @@
                 <w:sz w:val="19"/>
                 <w:szCs w:val="19"/>
               </w:rPr>
-              <w:t xml:space="preserve">O RF03 está especificado. A implementação será planejada junto com a nova data de congelamento de funcionalidades, que está em aberto.</w:t>
+              <w:t xml:space="preserve">Implementado em 28/10/2026 (revisão </w:t>
+            </w:r>
+            <w:r>
+              <w:rPr>
+                <w:rFonts w:ascii="Consolas" w:cs="Consolas" w:eastAsia="Consolas" w:hAnsi="Consolas"/>
+                <w:color w:val="2E5B85"/>
+                <w:sz w:val="17"/>
+                <w:szCs w:val="17"/>
+              </w:rPr>
+              <w:t xml:space="preserve">574e359</w:t>
+            </w:r>
+            <w:r>
+              <w:rPr>
+                <w:sz w:val="19"/>
+                <w:szCs w:val="19"/>
+              </w:rPr>
+              <w:t xml:space="preserve">) na forma mínima aprovada pela equipe: uma única tool de lote, </w:t>
+            </w:r>
+            <w:r>
+              <w:rPr>
+                <w:rFonts w:ascii="Consolas" w:cs="Consolas" w:eastAsia="Consolas" w:hAnsi="Consolas"/>
+                <w:color w:val="2E5B85"/>
+                <w:sz w:val="17"/>
+                <w:szCs w:val="17"/>
+              </w:rPr>
+              <w:t xml:space="preserve">conciliar_lancamentos_em_lote</w:t>
+            </w:r>
+            <w:r>
+              <w:rPr>
+                <w:sz w:val="19"/>
+                <w:szCs w:val="19"/>
+              </w:rPr>
+              <w:t xml:space="preserve">. Exclusão, restauração e outras entidades em lote ficaram fora de propósito, pelo risco e pela fadiga de confirmação.</w:t>
             </w:r>
           </w:p>
         </w:tc>
@@ -40763,9 +41305,9 @@
       <w:r>
         <w:drawing>
           <wp:inline distT="0" distB="0" distL="0" distR="0">
-            <wp:extent cx="4152900" cy="5667375"/>
+            <wp:extent cx="3867816" cy="6766560"/>
             <wp:effectExtent t="0" r="0" b="0" l="0"/>
-            <wp:docPr id="1" name="15_rf03_plano.png" descr="RF03 especificado: plano de ações com revisão de todos os itens e confirmação única." title="Figura 15"/>
+            <wp:docPr id="1" name="15_rf03_plano.png" descr="RF03: conciliação em lote com lista congelada, revisão item a item e confirmação única." title="Figura 15"/>
             <wp:cNvGraphicFramePr>
               <a:graphicFrameLocks xmlns:a="http://schemas.openxmlformats.org/drawingml/2006/main" noChangeAspect="1"/>
             </wp:cNvGraphicFramePr>
@@ -40788,7 +41330,7 @@
                   <pic:spPr bwMode="auto">
                     <a:xfrm>
                       <a:off x="0" y="0"/>
-                      <a:ext cx="4152900" cy="5667375"/>
+                      <a:ext cx="3867816" cy="6766560"/>
                     </a:xfrm>
                     <a:prstGeom prst="rect">
                       <a:avLst/>
@@ -40814,7 +41356,7 @@
           <w:sz w:val="18"/>
           <w:szCs w:val="18"/>
         </w:rPr>
-        <w:t xml:space="preserve">Figura 15 — RF03 especificado: plano de ações com revisão de todos os itens e confirmação única.</w:t>
+        <w:t xml:space="preserve">Figura 15 — RF03: conciliação em lote com lista congelada, revisão item a item e confirmação única.</w:t>
       </w:r>
     </w:p>
     <w:p>
@@ -40831,10 +41373,58 @@
           <w:b/>
           <w:bCs/>
         </w:rPr>
-        <w:t xml:space="preserve">Card de plano:</w:t>
-      </w:r>
-      <w:r>
-        <w:t xml:space="preserve"> total de itens ("12 lançamentos vão para conciliado"), lista item a item com o registro e o antes → depois, e borda pela cor do maior risco do lote.</w:t>
+        <w:t xml:space="preserve">Escopo:</w:t>
+      </w:r>
+      <w:r>
+        <w:t xml:space="preserve"> concilia (pendente → conciliado) os lançamentos pendentes de um período obrigatório (</w:t>
+      </w:r>
+      <w:r>
+        <w:rPr>
+          <w:rFonts w:ascii="Consolas" w:cs="Consolas" w:eastAsia="Consolas" w:hAnsi="Consolas"/>
+          <w:color w:val="2E5B85"/>
+          <w:sz w:val="19"/>
+          <w:szCs w:val="19"/>
+        </w:rPr>
+        <w:t xml:space="preserve">data_inicio</w:t>
+      </w:r>
+      <w:r>
+        <w:t xml:space="preserve"> e </w:t>
+      </w:r>
+      <w:r>
+        <w:rPr>
+          <w:rFonts w:ascii="Consolas" w:cs="Consolas" w:eastAsia="Consolas" w:hAnsi="Consolas"/>
+          <w:color w:val="2E5B85"/>
+          <w:sz w:val="19"/>
+          <w:szCs w:val="19"/>
+        </w:rPr>
+        <w:t xml:space="preserve">data_fim</w:t>
+      </w:r>
+      <w:r>
+        <w:t xml:space="preserve">) e, opcionalmente, de uma categoria. Papel mínimo: operador; na auditoria, </w:t>
+      </w:r>
+      <w:r>
+        <w:rPr>
+          <w:rFonts w:ascii="Consolas" w:cs="Consolas" w:eastAsia="Consolas" w:hAnsi="Consolas"/>
+          <w:color w:val="2E5B85"/>
+          <w:sz w:val="19"/>
+          <w:szCs w:val="19"/>
+        </w:rPr>
+        <w:t xml:space="preserve">acao</w:t>
+      </w:r>
+      <w:r>
+        <w:t xml:space="preserve"> = </w:t>
+      </w:r>
+      <w:r>
+        <w:rPr>
+          <w:rFonts w:ascii="Consolas" w:cs="Consolas" w:eastAsia="Consolas" w:hAnsi="Consolas"/>
+          <w:color w:val="2E5B85"/>
+          <w:sz w:val="19"/>
+          <w:szCs w:val="19"/>
+        </w:rPr>
+        <w:t xml:space="preserve">atualizar</w:t>
+      </w:r>
+      <w:r>
+        <w:t xml:space="preserve">.</w:t>
       </w:r>
     </w:p>
     <w:p>
@@ -40851,10 +41441,10 @@
           <w:b/>
           <w:bCs/>
         </w:rPr>
-        <w:t xml:space="preserve">Revisar:</w:t>
-      </w:r>
-      <w:r>
-        <w:t xml:space="preserve"> valida todos os itens (RBAC, tenant, Form Request, dependência); se um falhar, o plano volta apontando qual item e por quê.</w:t>
+        <w:t xml:space="preserve">Lista congelada:</w:t>
+      </w:r>
+      <w:r>
+        <w:t xml:space="preserve"> depois do RBAC, o servidor resolve o filtro uma única vez, no tenant, e guarda os ids no rascunho da sessão. O navegador nunca recebe os ids, e o Confirmar nunca refaz o filtro: grava exatamente o que o humano revisou.</w:t>
       </w:r>
     </w:p>
     <w:p>
@@ -40871,10 +41461,10 @@
           <w:b/>
           <w:bCs/>
         </w:rPr>
-        <w:t xml:space="preserve">Segurar uma vez:</w:t>
-      </w:r>
-      <w:r>
-        <w:t xml:space="preserve"> a gravação é feita numa única transação, tudo ou nada.</w:t>
+        <w:t xml:space="preserve">Teto de 25 itens:</w:t>
+      </w:r>
+      <w:r>
+        <w:t xml:space="preserve"> acima disso, nenhum plano é montado e o usuário é orientado a restringir o filtro; sem itens, a resposta é só texto. O lote nasce apenas de um pedido ao agente (o formulário sem IA recusa a tool).</w:t>
       </w:r>
     </w:p>
     <w:p>
@@ -40891,10 +41481,22 @@
           <w:b/>
           <w:bCs/>
         </w:rPr>
-        <w:t xml:space="preserve">Auditoria:</w:t>
-      </w:r>
-      <w:r>
-        <w:t xml:space="preserve"> uma linha por item, todas com o mesmo identificador de lote.</w:t>
+        <w:t xml:space="preserve">Card de plano:</w:t>
+      </w:r>
+      <w:r>
+        <w:t xml:space="preserve"> montado no servidor a partir dos ids (</w:t>
+      </w:r>
+      <w:r>
+        <w:rPr>
+          <w:rFonts w:ascii="Consolas" w:cs="Consolas" w:eastAsia="Consolas" w:hAnsi="Consolas"/>
+          <w:color w:val="2E5B85"/>
+          <w:sz w:val="19"/>
+          <w:szCs w:val="19"/>
+        </w:rPr>
+        <w:t xml:space="preserve">planoDoLote()</w:t>
+      </w:r>
+      <w:r>
+        <w:t xml:space="preserve">): período, categoria, quantidade, total e a tabela item a item (descrição, data, valor, pendente → conciliado), sem campo editável. Valores enviados pelo navegador são ignorados.</w:t>
       </w:r>
     </w:p>
     <w:p>
@@ -40911,10 +41513,110 @@
           <w:b/>
           <w:bCs/>
         </w:rPr>
-        <w:t xml:space="preserve">Teto de itens por plano</w:t>
-      </w:r>
-      <w:r>
-        <w:t xml:space="preserve"> e resumo do impacto sempre visível, contra a fadiga de confirmação.</w:t>
+        <w:t xml:space="preserve">Revisar:</w:t>
+      </w:r>
+      <w:r>
+        <w:t xml:space="preserve"> revalida cada item (tenant, existência, ainda pendente). Se um falhar, o plano volta apontando o item e o motivo (</w:t>
+      </w:r>
+      <w:r>
+        <w:rPr>
+          <w:rFonts w:ascii="Consolas" w:cs="Consolas" w:eastAsia="Consolas" w:hAnsi="Consolas"/>
+          <w:color w:val="2E5B85"/>
+          <w:sz w:val="19"/>
+          <w:szCs w:val="19"/>
+        </w:rPr>
+        <w:t xml:space="preserve">revisao_com_erro</w:t>
+      </w:r>
+      <w:r>
+        <w:t xml:space="preserve">), e o botão Revisar some; fica só o Cancelar.</w:t>
+      </w:r>
+    </w:p>
+    <w:p>
+      <w:pPr>
+        <w:pStyle w:val="ListParagraph"/>
+        <w:numPr>
+          <w:ilvl w:val="0"/>
+          <w:numId w:val="2"/>
+        </w:numPr>
+        <w:spacing w:after="60" w:line="290"/>
+      </w:pPr>
+      <w:r>
+        <w:rPr>
+          <w:b/>
+          <w:bCs/>
+        </w:rPr>
+        <w:t xml:space="preserve">Confirmar:</w:t>
+      </w:r>
+      <w:r>
+        <w:t xml:space="preserve"> numa transação, </w:t>
+      </w:r>
+      <w:r>
+        <w:rPr>
+          <w:rFonts w:ascii="Consolas" w:cs="Consolas" w:eastAsia="Consolas" w:hAnsi="Consolas"/>
+          <w:color w:val="2E5B85"/>
+          <w:sz w:val="19"/>
+          <w:szCs w:val="19"/>
+        </w:rPr>
+        <w:t xml:space="preserve">LancamentoService::conciliarLote()</w:t>
+      </w:r>
+      <w:r>
+        <w:t xml:space="preserve"> lê os itens com </w:t>
+      </w:r>
+      <w:r>
+        <w:rPr>
+          <w:rFonts w:ascii="Consolas" w:cs="Consolas" w:eastAsia="Consolas" w:hAnsi="Consolas"/>
+          <w:color w:val="2E5B85"/>
+          <w:sz w:val="19"/>
+          <w:szCs w:val="19"/>
+        </w:rPr>
+        <w:t xml:space="preserve">lockForUpdate</w:t>
+      </w:r>
+      <w:r>
+        <w:t xml:space="preserve">, reconfere todos e só então grava. Se algum item mudou entre o Revisar e o Confirmar, nada é gravado (rollback do lote inteiro).</w:t>
+      </w:r>
+    </w:p>
+    <w:p>
+      <w:pPr>
+        <w:pStyle w:val="ListParagraph"/>
+        <w:numPr>
+          <w:ilvl w:val="0"/>
+          <w:numId w:val="2"/>
+        </w:numPr>
+        <w:spacing w:after="60" w:line="290"/>
+      </w:pPr>
+      <w:r>
+        <w:rPr>
+          <w:b/>
+          <w:bCs/>
+        </w:rPr>
+        <w:t xml:space="preserve">Auditoria:</w:t>
+      </w:r>
+      <w:r>
+        <w:t xml:space="preserve"> no sucesso, uma linha por item, com </w:t>
+      </w:r>
+      <w:r>
+        <w:rPr>
+          <w:rFonts w:ascii="Consolas" w:cs="Consolas" w:eastAsia="Consolas" w:hAnsi="Consolas"/>
+          <w:color w:val="2E5B85"/>
+          <w:sz w:val="19"/>
+          <w:szCs w:val="19"/>
+        </w:rPr>
+        <w:t xml:space="preserve">valores_anteriores</w:t>
+      </w:r>
+      <w:r>
+        <w:t xml:space="preserve"> e o mesmo </w:t>
+      </w:r>
+      <w:r>
+        <w:rPr>
+          <w:rFonts w:ascii="Consolas" w:cs="Consolas" w:eastAsia="Consolas" w:hAnsi="Consolas"/>
+          <w:color w:val="2E5B85"/>
+          <w:sz w:val="19"/>
+          <w:szCs w:val="19"/>
+        </w:rPr>
+        <w:t xml:space="preserve">lote_id</w:t>
+      </w:r>
+      <w:r>
+        <w:t xml:space="preserve">. Lote recusado, com erro, cancelado ou expirado gera uma linha única, com os ids e os motivos nos parâmetros.</w:t>
       </w:r>
     </w:p>
     <w:p>
@@ -41936,48 +42638,48 @@
               <w:rPr>
                 <w:rFonts w:ascii="Consolas" w:cs="Consolas" w:eastAsia="Consolas" w:hAnsi="Consolas"/>
                 <w:color w:val="2E5B85"/>
+                <w:sz w:val="13"/>
+                <w:szCs w:val="13"/>
+              </w:rPr>
+              <w:t xml:space="preserve">lockForUpdate</w:t>
+            </w:r>
+            <w:r>
+              <w:rPr>
                 <w:sz w:val="15"/>
                 <w:szCs w:val="15"/>
               </w:rPr>
-              <w:t xml:space="preserve">lockForUpdate</w:t>
-            </w:r>
+              <w:t xml:space="preserve"> não tem efeito no SQLite dos testes</w:t>
+            </w:r>
+          </w:p>
+        </w:tc>
+        <w:tc>
+          <w:tcPr>
+            <w:tcW w:type="dxa" w:w="3991"/>
+            <w:tcBorders>
+              <w:top w:val="single" w:color="C9C2A8" w:sz="4"/>
+              <w:left w:val="single" w:color="C9C2A8" w:sz="4"/>
+              <w:bottom w:val="single" w:color="C9C2A8" w:sz="4"/>
+              <w:right w:val="single" w:color="C9C2A8" w:sz="4"/>
+            </w:tcBorders>
+            <w:shd w:fill="FFFFFF" w:color="auto" w:val="clear"/>
+            <w:tcMar>
+              <w:top w:type="dxa" w:w="60"/>
+              <w:left w:type="dxa" w:w="100"/>
+              <w:bottom w:type="dxa" w:w="60"/>
+              <w:right w:type="dxa" w:w="100"/>
+            </w:tcMar>
+            <w:vAlign w:val="center"/>
+          </w:tcPr>
+          <w:p>
+            <w:pPr>
+              <w:spacing w:after="20" w:line="260"/>
+            </w:pPr>
             <w:r>
               <w:rPr>
                 <w:sz w:val="17"/>
                 <w:szCs w:val="17"/>
               </w:rPr>
-              <w:t xml:space="preserve"> não tem efeito no SQLite dos testes</w:t>
-            </w:r>
-          </w:p>
-        </w:tc>
-        <w:tc>
-          <w:tcPr>
-            <w:tcW w:type="dxa" w:w="3991"/>
-            <w:tcBorders>
-              <w:top w:val="single" w:color="C9C2A8" w:sz="4"/>
-              <w:left w:val="single" w:color="C9C2A8" w:sz="4"/>
-              <w:bottom w:val="single" w:color="C9C2A8" w:sz="4"/>
-              <w:right w:val="single" w:color="C9C2A8" w:sz="4"/>
-            </w:tcBorders>
-            <w:shd w:fill="FFFFFF" w:color="auto" w:val="clear"/>
-            <w:tcMar>
-              <w:top w:type="dxa" w:w="60"/>
-              <w:left w:type="dxa" w:w="100"/>
-              <w:bottom w:type="dxa" w:w="60"/>
-              <w:right w:type="dxa" w:w="100"/>
-            </w:tcMar>
-            <w:vAlign w:val="center"/>
-          </w:tcPr>
-          <w:p>
-            <w:pPr>
-              <w:spacing w:after="20" w:line="260"/>
-            </w:pPr>
-            <w:r>
-              <w:rPr>
-                <w:sz w:val="17"/>
-                <w:szCs w:val="17"/>
-              </w:rPr>
-              <w:t xml:space="preserve">No MySQL a trava vale; o uso único do token é testado</w:t>
+              <w:t xml:space="preserve">No MySQL a trava vale; o uso único do token é testado. No RF03, o teste prova que o Confirmar pede a leitura travada; a disputa de dois Confirmar simultâneos só é conferida no MySQL</w:t>
             </w:r>
           </w:p>
         </w:tc>
@@ -42354,7 +43056,7 @@
                 <w:sz w:val="17"/>
                 <w:szCs w:val="17"/>
               </w:rPr>
-              <w:t xml:space="preserve">RF03 (ações em massa) não implementado</w:t>
+              <w:t xml:space="preserve">RF03 limitado a uma tool de lote (conciliação de lançamentos, até 25 itens)</w:t>
             </w:r>
           </w:p>
         </w:tc>
@@ -42385,7 +43087,7 @@
                 <w:sz w:val="17"/>
                 <w:szCs w:val="17"/>
               </w:rPr>
-              <w:t xml:space="preserve">Especificado na seção 13.3</w:t>
+              <w:t xml:space="preserve">Escopo mínimo deliberado; exclusão e restauração em lote ficaram fora pelo risco e pela fadiga de confirmação</w:t>
             </w:r>
           </w:p>
         </w:tc>
@@ -42938,7 +43640,7 @@
         <w:spacing w:after="60" w:line="290"/>
       </w:pPr>
       <w:r>
-        <w:t xml:space="preserve">Definir a nova data de congelamento de funcionalidades e decidir se o RF03 (plano de ações) entra antes dela.</w:t>
+        <w:t xml:space="preserve">Definir a nova data de congelamento de funcionalidades.</w:t>
       </w:r>
     </w:p>
     <w:p>
@@ -43072,6 +43774,19 @@
       </w:r>
       <w:r>
         <w:t xml:space="preserve">).</w:t>
+      </w:r>
+    </w:p>
+    <w:p>
+      <w:pPr>
+        <w:pStyle w:val="ListParagraph"/>
+        <w:numPr>
+          <w:ilvl w:val="0"/>
+          <w:numId w:val="2"/>
+        </w:numPr>
+        <w:spacing w:after="60" w:line="290"/>
+      </w:pPr>
+      <w:r>
+        <w:t xml:space="preserve">Ampliar as ações em massa (RF03) para outras operações, reaproveitando o padrão de lista congelada e tudo ou nada.</w:t>
       </w:r>
     </w:p>
     <w:p>

</xml_diff>